<commit_message>
docs: add POC document (markdown + Word)
</commit_message>
<xml_diff>
--- a/POC.docx
+++ b/POC.docx
@@ -2412,6 +2412,213 @@
     </w:p>
     <w:p>
       <w:pPr>
+        <w:pStyle w:val="Heading2"/>
+        <w:spacing w:after="120" w:before="240"/>
+      </w:pPr>
+      <w:r>
+        <w:t xml:space="preserve">Claude GitHub App (@claude bot on issues and PRs) — setup flow</w:t>
+      </w:r>
+    </w:p>
+    <w:p>
+      <w:pPr>
+        <w:spacing w:after="120"/>
+      </w:pPr>
+      <w:r>
+        <w:t xml:space="preserve">Not yet installed in this POC (listed in Next Steps); the setup process is:</w:t>
+      </w:r>
+    </w:p>
+    <w:p>
+      <w:pPr>
+        <w:pStyle w:val="ListParagraph"/>
+        <w:numPr>
+          <w:ilvl w:val="0"/>
+          <w:numId w:val="8"/>
+        </w:numPr>
+        <w:spacing w:after="60"/>
+      </w:pPr>
+      <w:r>
+        <w:t xml:space="preserve">Open a terminal in a clone of the repo, run </w:t>
+      </w:r>
+      <w:r>
+        <w:rPr>
+          <w:rFonts w:ascii="Courier New" w:cs="Courier New" w:eastAsia="Courier New" w:hAnsi="Courier New"/>
+          <w:sz w:val="20"/>
+          <w:szCs w:val="20"/>
+        </w:rPr>
+        <w:t xml:space="preserve">claude</w:t>
+      </w:r>
+      <w:r>
+        <w:t xml:space="preserve">, then type </w:t>
+      </w:r>
+      <w:r>
+        <w:rPr>
+          <w:rFonts w:ascii="Courier New" w:cs="Courier New" w:eastAsia="Courier New" w:hAnsi="Courier New"/>
+          <w:sz w:val="20"/>
+          <w:szCs w:val="20"/>
+        </w:rPr>
+        <w:t xml:space="preserve">/install-github-app</w:t>
+      </w:r>
+    </w:p>
+    <w:p>
+      <w:pPr>
+        <w:pStyle w:val="ListParagraph"/>
+        <w:numPr>
+          <w:ilvl w:val="0"/>
+          <w:numId w:val="8"/>
+        </w:numPr>
+        <w:spacing w:after="60"/>
+      </w:pPr>
+      <w:r>
+        <w:t xml:space="preserve">A guided wizard starts: choose the repository, authorize the </w:t>
+      </w:r>
+      <w:r>
+        <w:rPr>
+          <w:b/>
+          <w:bCs/>
+        </w:rPr>
+        <w:t xml:space="preserve">Claude GitHub App</w:t>
+      </w:r>
+      <w:r>
+        <w:t xml:space="preserve"> in the browser window it opens, and provide the AI credential — either an existing Claude Pro/Max subscription (OAuth token) or an Anthropic API key, stored as a repo secret (ANTHROPIC_API_KEY), never in code</w:t>
+      </w:r>
+    </w:p>
+    <w:p>
+      <w:pPr>
+        <w:pStyle w:val="ListParagraph"/>
+        <w:numPr>
+          <w:ilvl w:val="0"/>
+          <w:numId w:val="8"/>
+        </w:numPr>
+        <w:spacing w:after="60"/>
+      </w:pPr>
+      <w:r>
+        <w:t xml:space="preserve">The wizard opens a PR adding </w:t>
+      </w:r>
+      <w:r>
+        <w:rPr>
+          <w:rFonts w:ascii="Courier New" w:cs="Courier New" w:eastAsia="Courier New" w:hAnsi="Courier New"/>
+          <w:sz w:val="20"/>
+          <w:szCs w:val="20"/>
+        </w:rPr>
+        <w:t xml:space="preserve">.github/workflows/claude.yml</w:t>
+      </w:r>
+      <w:r>
+        <w:t xml:space="preserve"> — review and merge it</w:t>
+      </w:r>
+    </w:p>
+    <w:p>
+      <w:pPr>
+        <w:pStyle w:val="ListParagraph"/>
+        <w:numPr>
+          <w:ilvl w:val="0"/>
+          <w:numId w:val="8"/>
+        </w:numPr>
+        <w:spacing w:after="60"/>
+      </w:pPr>
+      <w:r>
+        <w:t xml:space="preserve">Done. Total time ≈ 10–15 minutes</w:t>
+      </w:r>
+    </w:p>
+    <w:p>
+      <w:pPr>
+        <w:spacing w:after="120"/>
+      </w:pPr>
+      <w:r>
+        <w:t xml:space="preserve">What it enables after setup:</w:t>
+      </w:r>
+    </w:p>
+    <w:p>
+      <w:pPr>
+        <w:pStyle w:val="ListParagraph"/>
+        <w:numPr>
+          <w:ilvl w:val="0"/>
+          <w:numId w:val="3"/>
+        </w:numPr>
+        <w:spacing w:after="60"/>
+      </w:pPr>
+      <w:r>
+        <w:t xml:space="preserve">Comment </w:t>
+      </w:r>
+      <w:r>
+        <w:rPr>
+          <w:rFonts w:ascii="Courier New" w:cs="Courier New" w:eastAsia="Courier New" w:hAnsi="Courier New"/>
+          <w:sz w:val="20"/>
+          <w:szCs w:val="20"/>
+        </w:rPr>
+        <w:t xml:space="preserve">@claude fix this</w:t>
+      </w:r>
+      <w:r>
+        <w:t xml:space="preserve"> on an issue → Claude writes the fix and opens a PR</w:t>
+      </w:r>
+    </w:p>
+    <w:p>
+      <w:pPr>
+        <w:pStyle w:val="ListParagraph"/>
+        <w:numPr>
+          <w:ilvl w:val="0"/>
+          <w:numId w:val="3"/>
+        </w:numPr>
+        <w:spacing w:after="60"/>
+      </w:pPr>
+      <w:r>
+        <w:t xml:space="preserve">Comment </w:t>
+      </w:r>
+      <w:r>
+        <w:rPr>
+          <w:rFonts w:ascii="Courier New" w:cs="Courier New" w:eastAsia="Courier New" w:hAnsi="Courier New"/>
+          <w:sz w:val="20"/>
+          <w:szCs w:val="20"/>
+        </w:rPr>
+        <w:t xml:space="preserve">@claude review this</w:t>
+      </w:r>
+      <w:r>
+        <w:t xml:space="preserve"> on a PR → Claude reviews the diff and leaves comments</w:t>
+      </w:r>
+    </w:p>
+    <w:p>
+      <w:pPr>
+        <w:pStyle w:val="ListParagraph"/>
+        <w:numPr>
+          <w:ilvl w:val="0"/>
+          <w:numId w:val="3"/>
+        </w:numPr>
+        <w:spacing w:after="60"/>
+      </w:pPr>
+      <w:r>
+        <w:t xml:space="preserve">Comment </w:t>
+      </w:r>
+      <w:r>
+        <w:rPr>
+          <w:rFonts w:ascii="Courier New" w:cs="Courier New" w:eastAsia="Courier New" w:hAnsi="Courier New"/>
+          <w:sz w:val="20"/>
+          <w:szCs w:val="20"/>
+        </w:rPr>
+        <w:t xml:space="preserve">@claude &lt;any change request&gt;</w:t>
+      </w:r>
+      <w:r>
+        <w:t xml:space="preserve"> on a PR → Claude pushes to that PR's branch</w:t>
+      </w:r>
+    </w:p>
+    <w:p>
+      <w:pPr>
+        <w:spacing w:after="120"/>
+      </w:pPr>
+      <w:r>
+        <w:t xml:space="preserve">How it works: each @claude mention triggers a </w:t>
+      </w:r>
+      <w:r>
+        <w:rPr>
+          <w:b/>
+          <w:bCs/>
+        </w:rPr>
+        <w:t xml:space="preserve">GitHub Actions</w:t>
+      </w:r>
+      <w:r>
+        <w:t xml:space="preserve"> run that executes Claude Code against the repo in GitHub's cloud — no laptop needed, and it follows the repo's CLAUDE.md rules just like a local session.</w:t>
+      </w:r>
+    </w:p>
+    <w:p>
+      <w:pPr>
         <w:pStyle w:val="Heading1"/>
         <w:spacing w:after="160" w:before="320"/>
       </w:pPr>
@@ -3038,15 +3245,378 @@
         <w:spacing w:after="160" w:before="320"/>
       </w:pPr>
       <w:r>
-        <w:t xml:space="preserve">8. Next Steps</w:t>
-      </w:r>
-    </w:p>
-    <w:p>
-      <w:pPr>
-        <w:pStyle w:val="ListParagraph"/>
-        <w:numPr>
-          <w:ilvl w:val="0"/>
-          <w:numId w:val="8"/>
+        <w:t xml:space="preserve">8. How to Replicate This in Your Project</w:t>
+      </w:r>
+    </w:p>
+    <w:p>
+      <w:pPr>
+        <w:spacing w:after="120"/>
+      </w:pPr>
+      <w:r>
+        <w:t xml:space="preserve">Anyone can rebuild this setup by combining this document (the process and the why) with this repository (the reference files to copy).</w:t>
+      </w:r>
+    </w:p>
+    <w:p>
+      <w:pPr>
+        <w:pStyle w:val="Heading2"/>
+        <w:spacing w:after="120" w:before="240"/>
+      </w:pPr>
+      <w:r>
+        <w:t xml:space="preserve">Prerequisites checklist</w:t>
+      </w:r>
+    </w:p>
+    <w:p>
+      <w:pPr>
+        <w:pStyle w:val="ListParagraph"/>
+        <w:numPr>
+          <w:ilvl w:val="0"/>
+          <w:numId w:val="3"/>
+        </w:numPr>
+        <w:spacing w:after="60"/>
+      </w:pPr>
+      <w:r>
+        <w:rPr>
+          <w:b/>
+          <w:bCs/>
+        </w:rPr>
+        <w:t xml:space="preserve">Claude Code</w:t>
+      </w:r>
+      <w:r>
+        <w:t xml:space="preserve"> installed (desktop app or CLI) and signed in</w:t>
+      </w:r>
+    </w:p>
+    <w:p>
+      <w:pPr>
+        <w:pStyle w:val="ListParagraph"/>
+        <w:numPr>
+          <w:ilvl w:val="0"/>
+          <w:numId w:val="3"/>
+        </w:numPr>
+        <w:spacing w:after="60"/>
+      </w:pPr>
+      <w:r>
+        <w:rPr>
+          <w:b/>
+          <w:bCs/>
+        </w:rPr>
+        <w:t xml:space="preserve">git</w:t>
+      </w:r>
+      <w:r>
+        <w:t xml:space="preserve"> installed (</w:t>
+      </w:r>
+      <w:r>
+        <w:rPr>
+          <w:rFonts w:ascii="Courier New" w:cs="Courier New" w:eastAsia="Courier New" w:hAnsi="Courier New"/>
+          <w:sz w:val="20"/>
+          <w:szCs w:val="20"/>
+        </w:rPr>
+        <w:t xml:space="preserve">git --version</w:t>
+      </w:r>
+      <w:r>
+        <w:t xml:space="preserve"> works in a terminal)</w:t>
+      </w:r>
+    </w:p>
+    <w:p>
+      <w:pPr>
+        <w:pStyle w:val="ListParagraph"/>
+        <w:numPr>
+          <w:ilvl w:val="0"/>
+          <w:numId w:val="3"/>
+        </w:numPr>
+        <w:spacing w:after="60"/>
+      </w:pPr>
+      <w:r>
+        <w:rPr>
+          <w:b/>
+          <w:bCs/>
+        </w:rPr>
+        <w:t xml:space="preserve">GitHub CLI</w:t>
+      </w:r>
+      <w:r>
+        <w:t xml:space="preserve"> authenticated: run </w:t>
+      </w:r>
+      <w:r>
+        <w:rPr>
+          <w:rFonts w:ascii="Courier New" w:cs="Courier New" w:eastAsia="Courier New" w:hAnsi="Courier New"/>
+          <w:sz w:val="20"/>
+          <w:szCs w:val="20"/>
+        </w:rPr>
+        <w:t xml:space="preserve">gh auth login</w:t>
+      </w:r>
+      <w:r>
+        <w:t xml:space="preserve"> once</w:t>
+      </w:r>
+    </w:p>
+    <w:p>
+      <w:pPr>
+        <w:pStyle w:val="ListParagraph"/>
+        <w:numPr>
+          <w:ilvl w:val="0"/>
+          <w:numId w:val="3"/>
+        </w:numPr>
+        <w:spacing w:after="60"/>
+      </w:pPr>
+      <w:r>
+        <w:t xml:space="preserve">A </w:t>
+      </w:r>
+      <w:r>
+        <w:rPr>
+          <w:b/>
+          <w:bCs/>
+        </w:rPr>
+        <w:t xml:space="preserve">GitHub account</w:t>
+      </w:r>
+      <w:r>
+        <w:t xml:space="preserve"> with permission to create a repository</w:t>
+      </w:r>
+    </w:p>
+    <w:p>
+      <w:pPr>
+        <w:pStyle w:val="ListParagraph"/>
+        <w:numPr>
+          <w:ilvl w:val="0"/>
+          <w:numId w:val="3"/>
+        </w:numPr>
+        <w:spacing w:after="60"/>
+      </w:pPr>
+      <w:r>
+        <w:t xml:space="preserve">A </w:t>
+      </w:r>
+      <w:r>
+        <w:rPr>
+          <w:b/>
+          <w:bCs/>
+        </w:rPr>
+        <w:t xml:space="preserve">ClickUp account</w:t>
+      </w:r>
+      <w:r>
+        <w:t xml:space="preserve"> (or your team's tracker) — connector enabled in your Claude workspace (may require an admin request, see Section 5)</w:t>
+      </w:r>
+    </w:p>
+    <w:p>
+      <w:pPr>
+        <w:pStyle w:val="Heading2"/>
+        <w:spacing w:after="120" w:before="240"/>
+      </w:pPr>
+      <w:r>
+        <w:t xml:space="preserve">Replication steps</w:t>
+      </w:r>
+    </w:p>
+    <w:p>
+      <w:pPr>
+        <w:pStyle w:val="ListParagraph"/>
+        <w:numPr>
+          <w:ilvl w:val="0"/>
+          <w:numId w:val="9"/>
+        </w:numPr>
+        <w:spacing w:after="60"/>
+      </w:pPr>
+      <w:r>
+        <w:rPr>
+          <w:b/>
+          <w:bCs/>
+        </w:rPr>
+        <w:t xml:space="preserve">Create your repo</w:t>
+      </w:r>
+      <w:r>
+        <w:t xml:space="preserve"> on GitHub (empty), clone it locally, open Claude Code in it.</w:t>
+      </w:r>
+    </w:p>
+    <w:p>
+      <w:pPr>
+        <w:pStyle w:val="ListParagraph"/>
+        <w:numPr>
+          <w:ilvl w:val="0"/>
+          <w:numId w:val="9"/>
+        </w:numPr>
+        <w:spacing w:after="60"/>
+      </w:pPr>
+      <w:r>
+        <w:rPr>
+          <w:b/>
+          <w:bCs/>
+        </w:rPr>
+        <w:t xml:space="preserve">Copy the reference files from this repo</w:t>
+      </w:r>
+      <w:r>
+        <w:t xml:space="preserve"> as starting templates: </w:t>
+      </w:r>
+      <w:r>
+        <w:rPr>
+          <w:rFonts w:ascii="Courier New" w:cs="Courier New" w:eastAsia="Courier New" w:hAnsi="Courier New"/>
+          <w:sz w:val="20"/>
+          <w:szCs w:val="20"/>
+        </w:rPr>
+        <w:t xml:space="preserve">CLAUDE.md</w:t>
+      </w:r>
+      <w:r>
+        <w:t xml:space="preserve"> → rewrite the rules for *your* project, keeping the format (short root file + Hard Rules + Nested docs line); </w:t>
+      </w:r>
+      <w:r>
+        <w:rPr>
+          <w:rFonts w:ascii="Courier New" w:cs="Courier New" w:eastAsia="Courier New" w:hAnsi="Courier New"/>
+          <w:sz w:val="20"/>
+          <w:szCs w:val="20"/>
+        </w:rPr>
+        <w:t xml:space="preserve">docs/*.md</w:t>
+      </w:r>
+      <w:r>
+        <w:t xml:space="preserve"> → replace with docs for your project's real modules; </w:t>
+      </w:r>
+      <w:r>
+        <w:rPr>
+          <w:rFonts w:ascii="Courier New" w:cs="Courier New" w:eastAsia="Courier New" w:hAnsi="Courier New"/>
+          <w:sz w:val="20"/>
+          <w:szCs w:val="20"/>
+        </w:rPr>
+        <w:t xml:space="preserve">.claude/settings.json</w:t>
+      </w:r>
+      <w:r>
+        <w:t xml:space="preserve"> → keep the allow/ask/deny skeleton, adjust the commands to your stack; </w:t>
+      </w:r>
+      <w:r>
+        <w:rPr>
+          <w:rFonts w:ascii="Courier New" w:cs="Courier New" w:eastAsia="Courier New" w:hAnsi="Courier New"/>
+          <w:sz w:val="20"/>
+          <w:szCs w:val="20"/>
+        </w:rPr>
+        <w:t xml:space="preserve">.claude/skills/</w:t>
+      </w:r>
+      <w:r>
+        <w:t xml:space="preserve"> → copy both skills and edit the project-specific parts.</w:t>
+      </w:r>
+    </w:p>
+    <w:p>
+      <w:pPr>
+        <w:pStyle w:val="ListParagraph"/>
+        <w:numPr>
+          <w:ilvl w:val="0"/>
+          <w:numId w:val="9"/>
+        </w:numPr>
+        <w:spacing w:after="60"/>
+      </w:pPr>
+      <w:r>
+        <w:rPr>
+          <w:b/>
+          <w:bCs/>
+        </w:rPr>
+        <w:t xml:space="preserve">⚠️ The one thing that MUST change:</w:t>
+      </w:r>
+      <w:r>
+        <w:t xml:space="preserve"> the ClickUp rules in settings.json contain a connector ID (mcp__&lt;long-id&gt;__clickup_*) that is </w:t>
+      </w:r>
+      <w:r>
+        <w:rPr>
+          <w:b/>
+          <w:bCs/>
+        </w:rPr>
+        <w:t xml:space="preserve">specific to our workspace</w:t>
+      </w:r>
+      <w:r>
+        <w:t xml:space="preserve">. Get your own ID by connecting ClickUp in your Claude workspace and asking Claude: “what is the tool name of the ClickUp create-task tool?” — then replace the ID in every rule.</w:t>
+      </w:r>
+    </w:p>
+    <w:p>
+      <w:pPr>
+        <w:pStyle w:val="ListParagraph"/>
+        <w:numPr>
+          <w:ilvl w:val="0"/>
+          <w:numId w:val="9"/>
+        </w:numPr>
+        <w:spacing w:after="60"/>
+      </w:pPr>
+      <w:r>
+        <w:rPr>
+          <w:b/>
+          <w:bCs/>
+        </w:rPr>
+        <w:t xml:space="preserve">Set up deployment</w:t>
+      </w:r>
+      <w:r>
+        <w:t xml:space="preserve"> (optional, for web projects): Settings → Pages, per Section 5.</w:t>
+      </w:r>
+    </w:p>
+    <w:p>
+      <w:pPr>
+        <w:pStyle w:val="ListParagraph"/>
+        <w:numPr>
+          <w:ilvl w:val="0"/>
+          <w:numId w:val="9"/>
+        </w:numPr>
+        <w:spacing w:after="60"/>
+      </w:pPr>
+      <w:r>
+        <w:rPr>
+          <w:b/>
+          <w:bCs/>
+        </w:rPr>
+        <w:t xml:space="preserve">Work only through PRs</w:t>
+      </w:r>
+      <w:r>
+        <w:t xml:space="preserve"> from day one — branch, push, PR, merge (Section 4, Phase 3).</w:t>
+      </w:r>
+    </w:p>
+    <w:p>
+      <w:pPr>
+        <w:pStyle w:val="ListParagraph"/>
+        <w:numPr>
+          <w:ilvl w:val="0"/>
+          <w:numId w:val="9"/>
+        </w:numPr>
+        <w:spacing w:after="60"/>
+      </w:pPr>
+      <w:r>
+        <w:rPr>
+          <w:b/>
+          <w:bCs/>
+        </w:rPr>
+        <w:t xml:space="preserve">Verify the guard rails:</w:t>
+      </w:r>
+      <w:r>
+        <w:t xml:space="preserve"> in a fresh Claude session in the repo, ask Claude to edit a file — it must prompt for permission. Ask it to create a ClickUp task — it must prompt again. If either runs silently, re-check </w:t>
+      </w:r>
+      <w:r>
+        <w:rPr>
+          <w:rFonts w:ascii="Courier New" w:cs="Courier New" w:eastAsia="Courier New" w:hAnsi="Courier New"/>
+          <w:sz w:val="20"/>
+          <w:szCs w:val="20"/>
+        </w:rPr>
+        <w:t xml:space="preserve">.claude/settings.json</w:t>
+      </w:r>
+      <w:r>
+        <w:t xml:space="preserve">.</w:t>
+      </w:r>
+    </w:p>
+    <w:p>
+      <w:pPr>
+        <w:spacing w:after="120"/>
+      </w:pPr>
+      <w:r>
+        <w:rPr>
+          <w:b/>
+          <w:bCs/>
+        </w:rPr>
+        <w:t xml:space="preserve">Rule of thumb:</w:t>
+      </w:r>
+      <w:r>
+        <w:t xml:space="preserve"> the *structure* (files, tiers, workflow) transfers to any project unchanged; the *contents* (rules, commands, connector IDs, skill details) are always project-specific.</w:t>
+      </w:r>
+    </w:p>
+    <w:p>
+      <w:pPr>
+        <w:pStyle w:val="Heading1"/>
+        <w:spacing w:after="160" w:before="320"/>
+      </w:pPr>
+      <w:r>
+        <w:t xml:space="preserve">9. Next Steps</w:t>
+      </w:r>
+    </w:p>
+    <w:p>
+      <w:pPr>
+        <w:pStyle w:val="ListParagraph"/>
+        <w:numPr>
+          <w:ilvl w:val="0"/>
+          <w:numId w:val="10"/>
         </w:numPr>
         <w:spacing w:after="60"/>
       </w:pPr>
@@ -3066,7 +3636,7 @@
         <w:pStyle w:val="ListParagraph"/>
         <w:numPr>
           <w:ilvl w:val="0"/>
-          <w:numId w:val="8"/>
+          <w:numId w:val="10"/>
         </w:numPr>
         <w:spacing w:after="60"/>
       </w:pPr>
@@ -3086,7 +3656,7 @@
         <w:pStyle w:val="ListParagraph"/>
         <w:numPr>
           <w:ilvl w:val="0"/>
-          <w:numId w:val="8"/>
+          <w:numId w:val="10"/>
         </w:numPr>
         <w:spacing w:after="60"/>
       </w:pPr>
@@ -3106,7 +3676,7 @@
         <w:pStyle w:val="ListParagraph"/>
         <w:numPr>
           <w:ilvl w:val="0"/>
-          <w:numId w:val="8"/>
+          <w:numId w:val="10"/>
         </w:numPr>
         <w:spacing w:after="60"/>
       </w:pPr>
@@ -3126,7 +3696,7 @@
         <w:pStyle w:val="ListParagraph"/>
         <w:numPr>
           <w:ilvl w:val="0"/>
-          <w:numId w:val="8"/>
+          <w:numId w:val="10"/>
         </w:numPr>
         <w:spacing w:after="60"/>
       </w:pPr>
@@ -3397,6 +3967,30 @@
     </w:lvl>
   </w:abstractNum>
   <w:abstractNum w:abstractNumId="8" w15:restartNumberingAfterBreak="0">
+    <w:multiLevelType w:val="hybridMultilevel"/>
+    <w:lvl w:ilvl="0" w15:tentative="1">
+      <w:start w:val="1"/>
+      <w:numFmt w:val="decimal"/>
+      <w:lvlText w:val="%1."/>
+      <w:lvlJc w:val="start"/>
+      <w:pPr>
+        <w:ind w:left="480" w:hanging="300"/>
+      </w:pPr>
+    </w:lvl>
+  </w:abstractNum>
+  <w:abstractNum w:abstractNumId="9" w15:restartNumberingAfterBreak="0">
+    <w:multiLevelType w:val="hybridMultilevel"/>
+    <w:lvl w:ilvl="0" w15:tentative="1">
+      <w:start w:val="1"/>
+      <w:numFmt w:val="decimal"/>
+      <w:lvlText w:val="%1."/>
+      <w:lvlJc w:val="start"/>
+      <w:pPr>
+        <w:ind w:left="480" w:hanging="300"/>
+      </w:pPr>
+    </w:lvl>
+  </w:abstractNum>
+  <w:abstractNum w:abstractNumId="10" w15:restartNumberingAfterBreak="0">
     <w:multiLevelType w:val="hybridMultilevel"/>
     <w:lvl w:ilvl="0" w15:tentative="1">
       <w:start w:val="1"/>
@@ -3451,6 +4045,18 @@
     </w:lvlOverride>
   </w:num>
   <w:num w:numId="8">
+    <w:abstractNumId w:val="9"/>
+    <w:lvlOverride w:ilvl="0">
+      <w:startOverride w:val="1"/>
+    </w:lvlOverride>
+  </w:num>
+  <w:num w:numId="9">
+    <w:abstractNumId w:val="10"/>
+    <w:lvlOverride w:ilvl="0">
+      <w:startOverride w:val="1"/>
+    </w:lvlOverride>
+  </w:num>
+  <w:num w:numId="10">
     <w:abstractNumId w:val="7"/>
     <w:lvlOverride w:ilvl="0">
       <w:startOverride w:val="1"/>

</xml_diff>